<commit_message>
Rising Sun: setup sheet v2, the two stale lines about the old panel fixed
Co-Authored-By: Claude Sonnet 5.5 <noreply@anthropic.com>
Claude-Session: https://claude.ai/code/session_01HHRsqL7L57Qm5aUfHKQdYK
</commit_message>
<xml_diff>
--- a/rising-sun/Rising-Sun_Your-Setup_2026-10-18_v2.docx
+++ b/rising-sun/Rising-Sun_Your-Setup_2026-10-18_v2.docx
@@ -192,7 +192,7 @@
       </w:pPr>
       <w:r>
         <w:rPr/>
-        <w:t>1. On the panel, under "Talk to her", press Wake me. She should greet you and ask her question.</w:t>
+        <w:t>1. On the panel, pick a fairy at the top, then press Wake me under Chat. They should greet you and ask their question.</w:t>
       </w:r>
     </w:p>
     <w:p>
@@ -589,7 +589,7 @@
       </w:pPr>
       <w:r>
         <w:rPr/>
-        <w:t>1. Under "5. Music," choose Spotify and press "Connect Spotify." Spotify asks you to approve, then brings you back to the panel.</w:t>
+        <w:t>1. On the panel, pick Poppy at the top. Under Music, choose Spotify and press "Connect Spotify." Spotify asks you to approve, then brings you back to the panel.</w:t>
       </w:r>
     </w:p>
     <w:p>

</xml_diff>